<commit_message>
Add working-space specification as attachment to letter 01
The operations plan required a written technical specification for the
onboard working room but none existed, so letter 01 asked the operator
about the salon without defining what it must satisfy.

The new file holds two parts: an English specification to send with
letter 01 (enclosed room, 20 seats with backrests, sockets, local
climate control, engine-room position and measured noise under way,
and an exclusive-use clause covering no cleaning, no table laying and
no background music during the session block), plus a Russian
acceptance checklist to run on board before the first session,
including a noise check taken while the vessel is moving rather than
moored.

Letter 01 now names the attachment as mandatory.

Co-Authored-By: Claude Opus 5 <noreply@anthropic.com>
Claude-Session: https://claude.ai/code/session_01KQFm1d6HbwvN6nT4uerjN3
</commit_message>
<xml_diff>
--- a/egypt-jan-2027/Письма/Письмо-01_Судовой-оператор_Запрос-фрахта.docx
+++ b/egypt-jan-2027/Письма/Письмо-01_Судовой-оператор_Запрос-фрахта.docx
@@ -314,6 +314,60 @@
                 <w:sz w:val="19"/>
               </w:rPr>
               <w:t>это письмо определяет, какой вариант маршрута вы покупаете. Без ответа на вопрос о ночном движении нельзя выбрать между вариантом A и вариантом B1.</w:t>
+            </w:r>
+          </w:p>
+        </w:tc>
+      </w:tr>
+      <w:tr>
+        <w:tc>
+          <w:tcPr>
+            <w:tcW w:type="dxa" w:w="4929"/>
+            <w:shd w:val="clear" w:fill="F2F5FA"/>
+          </w:tcPr>
+          <w:p>
+            <w:pPr>
+              <w:spacing w:after="40"/>
+            </w:pPr>
+            <w:r>
+              <w:rPr>
+                <w:sz w:val="19"/>
+              </w:rPr>
+            </w:r>
+            <w:r>
+              <w:rPr>
+                <w:b/>
+                <w:sz w:val="19"/>
+              </w:rPr>
+              <w:t>ВЛОЖЕНИЕ</w:t>
+            </w:r>
+          </w:p>
+        </w:tc>
+        <w:tc>
+          <w:tcPr>
+            <w:tcW w:type="dxa" w:w="4929"/>
+            <w:shd w:val="clear" w:fill="F2F5FA"/>
+          </w:tcPr>
+          <w:p>
+            <w:pPr>
+              <w:spacing w:after="40"/>
+            </w:pPr>
+            <w:r>
+              <w:rPr>
+                <w:sz w:val="19"/>
+              </w:rPr>
+            </w:r>
+            <w:r>
+              <w:rPr>
+                <w:rFonts w:ascii="Consolas" w:hAnsi="Consolas"/>
+                <w:sz w:val="19"/>
+              </w:rPr>
+              <w:t>Приложение-к-письму-01_ТЗ-рабочий-салон.docx</w:t>
+            </w:r>
+            <w:r>
+              <w:rPr>
+                <w:sz w:val="19"/>
+              </w:rPr>
+              <w:t>. Отправлять обязательно: без него пункт 16 письма останется без ответа по существу</w:t>
             </w:r>
           </w:p>
         </w:tc>

</xml_diff>